<commit_message>
Modernize resume format and content
</commit_message>
<xml_diff>
--- a/resume/Ayush-Madhukar-Resume.docx
+++ b/resume/Ayush-Madhukar-Resume.docx
@@ -4,82 +4,100 @@
   <w:body>
     <w:p>
       <w:pPr>
-        <w:spacing w:before="0" w:after="20"/>
+        <w:spacing w:before="0" w:after="20" w:line="240" w:lineRule="auto"/>
+        <w:jc w:val="center"/>
+      </w:pPr>
+      <w:r>
+        <w:rPr>
+          <w:rFonts w:ascii="Arial" w:hAnsi="Arial"/>
+          <w:b/>
+          <w:i w:val="0"/>
+          <w:color w:val="000000"/>
+          <w:sz w:val="40"/>
+        </w:rPr>
+        <w:t>AYUSH MADHUKAR</w:t>
+      </w:r>
+    </w:p>
+    <w:p>
+      <w:pPr>
+        <w:spacing w:before="0" w:after="40" w:line="240" w:lineRule="auto"/>
         <w:jc w:val="center"/>
       </w:pPr>
       <w:r>
         <w:rPr>
           <w:rFonts w:ascii="Arial" w:hAnsi="Arial"/>
           <w:b w:val="0"/>
+          <w:i w:val="0"/>
           <w:color w:val="000000"/>
-          <w:sz w:val="52"/>
+          <w:sz w:val="18"/>
         </w:rPr>
-        <w:t>AYUSH MADHUKAR</w:t>
-      </w:r>
-    </w:p>
-    <w:p>
-      <w:pPr>
-        <w:spacing w:after="100"/>
-        <w:jc w:val="center"/>
-      </w:pPr>
-      <w:r>
         <w:t xml:space="preserve">Bay Area, California  |  </w:t>
       </w:r>
       <w:hyperlink r:id="rId9">
         <w:r>
           <w:rPr>
+            <w:rFonts w:ascii="Arial" w:hAnsi="Arial"/>
             <w:color w:val="000000"/>
             <w:u w:val="single"/>
+            <w:sz w:val="18"/>
           </w:rPr>
           <w:t>hello@ayumad.me</w:t>
         </w:r>
       </w:hyperlink>
       <w:r>
+        <w:rPr>
+          <w:rFonts w:ascii="Arial" w:hAnsi="Arial"/>
+          <w:b w:val="0"/>
+          <w:i w:val="0"/>
+          <w:color w:val="000000"/>
+          <w:sz w:val="18"/>
+        </w:rPr>
         <w:t xml:space="preserve">  |  </w:t>
       </w:r>
       <w:hyperlink r:id="rId10">
         <w:r>
           <w:rPr>
+            <w:rFonts w:ascii="Arial" w:hAnsi="Arial"/>
             <w:color w:val="000000"/>
             <w:u w:val="single"/>
+            <w:sz w:val="18"/>
           </w:rPr>
           <w:t>ayumad.me</w:t>
         </w:r>
       </w:hyperlink>
       <w:r>
+        <w:rPr>
+          <w:rFonts w:ascii="Arial" w:hAnsi="Arial"/>
+          <w:b w:val="0"/>
+          <w:i w:val="0"/>
+          <w:color w:val="000000"/>
+          <w:sz w:val="18"/>
+        </w:rPr>
         <w:t xml:space="preserve">  |  </w:t>
       </w:r>
       <w:hyperlink r:id="rId11">
         <w:r>
           <w:rPr>
+            <w:rFonts w:ascii="Arial" w:hAnsi="Arial"/>
             <w:color w:val="000000"/>
             <w:u w:val="single"/>
+            <w:sz w:val="18"/>
           </w:rPr>
-          <w:t>github.com/ayumad</w:t>
+          <w:t>github.com/Ayumad</w:t>
         </w:r>
       </w:hyperlink>
     </w:p>
     <w:p>
       <w:pPr>
-        <w:spacing w:after="80"/>
-        <w:jc w:val="left"/>
-      </w:pPr>
-      <w:r>
-        <w:t>Computer Engineering student building practical AI and systems projects across local-first agents, knowledge retrieval, Linux infrastructure, and modern web interfaces. Focused on making complex personal technology reliable, understandable, and reusable.</w:t>
-      </w:r>
-    </w:p>
-    <w:p>
-      <w:pPr>
-        <w:keepNext/>
-        <w:spacing w:before="140" w:after="60"/>
-        <w:pBdr>
-          <w:bottom w:val="single" w:sz="6" w:space="2" w:color="B7B7B7"/>
-        </w:pBdr>
+        <w:pStyle w:val="ResumeSection"/>
+        <w:spacing w:before="110" w:after="50" w:line="240" w:lineRule="auto"/>
       </w:pPr>
       <w:r>
         <w:rPr>
           <w:rFonts w:ascii="Arial" w:hAnsi="Arial"/>
           <w:b/>
+          <w:i w:val="0"/>
+          <w:color w:val="000000"/>
           <w:sz w:val="21"/>
         </w:rPr>
         <w:t>EDUCATION</w:t>
@@ -87,44 +105,98 @@
     </w:p>
     <w:p>
       <w:pPr>
-        <w:spacing w:after="20"/>
+        <w:pStyle w:val="ResumeEntry"/>
+        <w:tabs>
+          <w:tab w:pos="10656" w:val="right"/>
+        </w:tabs>
+        <w:spacing w:before="24" w:after="8" w:line="240" w:lineRule="auto"/>
       </w:pPr>
       <w:r>
         <w:rPr>
+          <w:rFonts w:ascii="Arial" w:hAnsi="Arial"/>
           <w:b/>
+          <w:i w:val="0"/>
+          <w:color w:val="000000"/>
+          <w:sz w:val="20"/>
         </w:rPr>
         <w:t>San José State University</w:t>
       </w:r>
       <w:r>
-        <w:t xml:space="preserve"> — B.S. Computer Engineering, in progress</w:t>
+        <w:rPr>
+          <w:rFonts w:ascii="Arial" w:hAnsi="Arial"/>
+          <w:b w:val="0"/>
+          <w:i/>
+          <w:color w:val="000000"/>
+          <w:sz w:val="19"/>
+        </w:rPr>
+        <w:t xml:space="preserve">  |  B.S. Computer Engineering, in progress</w:t>
+      </w:r>
+      <w:r>
+        <w:rPr>
+          <w:rFonts w:ascii="Arial" w:hAnsi="Arial"/>
+          <w:b w:val="0"/>
+          <w:i/>
+          <w:color w:val="464646"/>
+          <w:sz w:val="18"/>
+        </w:rPr>
+        <w:tab/>
+        <w:t>January 2024 – Present</w:t>
       </w:r>
     </w:p>
     <w:p>
       <w:pPr>
-        <w:spacing w:after="40"/>
+        <w:pStyle w:val="ResumeEntry"/>
+        <w:tabs>
+          <w:tab w:pos="10656" w:val="right"/>
+        </w:tabs>
+        <w:spacing w:before="24" w:after="8" w:line="240" w:lineRule="auto"/>
       </w:pPr>
       <w:r>
         <w:rPr>
+          <w:rFonts w:ascii="Arial" w:hAnsi="Arial"/>
           <w:b/>
+          <w:i w:val="0"/>
+          <w:color w:val="000000"/>
+          <w:sz w:val="20"/>
         </w:rPr>
         <w:t>Foothill College</w:t>
       </w:r>
       <w:r>
-        <w:t xml:space="preserve"> — Computer Science studies</w:t>
+        <w:rPr>
+          <w:rFonts w:ascii="Arial" w:hAnsi="Arial"/>
+          <w:b w:val="0"/>
+          <w:i/>
+          <w:color w:val="000000"/>
+          <w:sz w:val="19"/>
+        </w:rPr>
+        <w:t xml:space="preserve">  |  Associate degree studies, Computer Science</w:t>
+      </w:r>
+      <w:r>
+        <w:rPr>
+          <w:rFonts w:ascii="Arial" w:hAnsi="Arial"/>
+          <w:b w:val="0"/>
+          <w:i/>
+          <w:color w:val="464646"/>
+          <w:sz w:val="18"/>
+        </w:rPr>
+        <w:tab/>
+        <w:t>January 2022 – January 2024</w:t>
       </w:r>
     </w:p>
     <w:p>
       <w:pPr>
-        <w:keepNext/>
-        <w:spacing w:before="140" w:after="60"/>
+        <w:pStyle w:val="ResumeSection"/>
+        <w:spacing w:before="110" w:after="50" w:line="240" w:lineRule="auto"/>
         <w:pBdr>
-          <w:bottom w:val="single" w:sz="6" w:space="2" w:color="B7B7B7"/>
+          <w:bottom w:val="single" w:sz="6" w:space="1" w:color="000000"/>
         </w:pBdr>
       </w:pPr>
       <w:r>
         <w:rPr>
           <w:rFonts w:ascii="Arial" w:hAnsi="Arial"/>
           <w:b/>
+          <w:i w:val="0"/>
+          <w:color w:val="000000"/>
           <w:sz w:val="21"/>
         </w:rPr>
         <w:t>SELECTED PROJECTS</w:t>
@@ -132,176 +204,469 @@
     </w:p>
     <w:p>
       <w:pPr>
-        <w:keepNext/>
-        <w:spacing w:before="60" w:after="20"/>
+        <w:pStyle w:val="ResumeEntry"/>
+        <w:tabs>
+          <w:tab w:pos="10656" w:val="right"/>
+        </w:tabs>
+        <w:spacing w:before="24" w:after="8" w:line="240" w:lineRule="auto"/>
       </w:pPr>
       <w:r>
         <w:rPr>
+          <w:rFonts w:ascii="Arial" w:hAnsi="Arial"/>
           <w:b/>
-          <w:sz w:val="19"/>
+          <w:i w:val="0"/>
+          <w:color w:val="000000"/>
+          <w:sz w:val="20"/>
         </w:rPr>
         <w:t>Hermes</w:t>
       </w:r>
       <w:r>
         <w:rPr>
+          <w:rFonts w:ascii="Arial" w:hAnsi="Arial"/>
+          <w:b w:val="0"/>
           <w:i/>
+          <w:color w:val="000000"/>
+          <w:sz w:val="19"/>
+        </w:rPr>
+        <w:t xml:space="preserve">  |  Personal AI system</w:t>
+      </w:r>
+      <w:r>
+        <w:rPr>
+          <w:rFonts w:ascii="Arial" w:hAnsi="Arial"/>
+          <w:b w:val="0"/>
+          <w:i/>
+          <w:color w:val="464646"/>
           <w:sz w:val="18"/>
         </w:rPr>
-        <w:t xml:space="preserve">  |  Personal AI system</w:t>
+        <w:tab/>
+        <w:t>Python · macOS · Tailscale · RAG</w:t>
       </w:r>
     </w:p>
     <w:p>
       <w:pPr>
-        <w:pStyle w:val="ListBullet"/>
-        <w:spacing w:after="30" w:line="245" w:lineRule="auto"/>
-        <w:ind w:left="288" w:hanging="230"/>
+        <w:pStyle w:val="ResumeBullet"/>
+        <w:spacing w:before="0" w:after="14" w:line="240" w:lineRule="auto"/>
       </w:pPr>
       <w:r>
-        <w:t>Designed a persistent agent backend on an M4 Mac mini so desktop, laptop, and mobile clients can share workflows and tools over a private mesh.</w:t>
+        <w:rPr>
+          <w:rFonts w:ascii="Arial" w:hAnsi="Arial"/>
+          <w:b w:val="0"/>
+          <w:i w:val="0"/>
+          <w:color w:val="000000"/>
+          <w:sz w:val="19"/>
+        </w:rPr>
+        <w:t>Designed a persistent agent backend on an M4 Mac mini so desktop, laptop, and mobile clients share workflows and tools over a private mesh.</w:t>
       </w:r>
     </w:p>
     <w:p>
       <w:pPr>
-        <w:pStyle w:val="ListBullet"/>
-        <w:spacing w:after="30" w:line="245" w:lineRule="auto"/>
-        <w:ind w:left="288" w:hanging="230"/>
+        <w:pStyle w:val="ResumeBullet"/>
+        <w:spacing w:before="0" w:after="14" w:line="240" w:lineRule="auto"/>
       </w:pPr>
       <w:r>
+        <w:rPr>
+          <w:rFonts w:ascii="Arial" w:hAnsi="Arial"/>
+          <w:b w:val="0"/>
+          <w:i w:val="0"/>
+          <w:color w:val="000000"/>
+          <w:sz w:val="19"/>
+        </w:rPr>
         <w:t>Developing scoped memory and retrieval boundaries that surface useful context without exposing an unrestricted private notebook.</w:t>
       </w:r>
     </w:p>
     <w:p>
       <w:pPr>
-        <w:keepNext/>
-        <w:spacing w:before="60" w:after="20"/>
+        <w:pStyle w:val="ResumeEntry"/>
+        <w:tabs>
+          <w:tab w:pos="10656" w:val="right"/>
+        </w:tabs>
+        <w:spacing w:before="24" w:after="8" w:line="240" w:lineRule="auto"/>
       </w:pPr>
       <w:r>
         <w:rPr>
+          <w:rFonts w:ascii="Arial" w:hAnsi="Arial"/>
           <w:b/>
-          <w:sz w:val="19"/>
+          <w:i w:val="0"/>
+          <w:color w:val="000000"/>
+          <w:sz w:val="20"/>
         </w:rPr>
         <w:t>Obsidian RAG</w:t>
       </w:r>
       <w:r>
         <w:rPr>
+          <w:rFonts w:ascii="Arial" w:hAnsi="Arial"/>
+          <w:b w:val="0"/>
           <w:i/>
+          <w:color w:val="000000"/>
+          <w:sz w:val="19"/>
+        </w:rPr>
+        <w:t xml:space="preserve">  |  Knowledge retrieval</w:t>
+      </w:r>
+      <w:r>
+        <w:rPr>
+          <w:rFonts w:ascii="Arial" w:hAnsi="Arial"/>
+          <w:b w:val="0"/>
+          <w:i/>
+          <w:color w:val="464646"/>
           <w:sz w:val="18"/>
         </w:rPr>
-        <w:t xml:space="preserve">  |  Knowledge retrieval</w:t>
+        <w:tab/>
+        <w:t>Python · Embeddings · Retrieval</w:t>
       </w:r>
     </w:p>
     <w:p>
       <w:pPr>
-        <w:pStyle w:val="ListBullet"/>
-        <w:spacing w:after="30" w:line="245" w:lineRule="auto"/>
-        <w:ind w:left="288" w:hanging="230"/>
+        <w:pStyle w:val="ResumeBullet"/>
+        <w:spacing w:before="0" w:after="14" w:line="240" w:lineRule="auto"/>
       </w:pPr>
       <w:r>
+        <w:rPr>
+          <w:rFonts w:ascii="Arial" w:hAnsi="Arial"/>
+          <w:b w:val="0"/>
+          <w:i w:val="0"/>
+          <w:color w:val="000000"/>
+          <w:sz w:val="19"/>
+        </w:rPr>
         <w:t>Building a visibility-aware retrieval layer for grounded question answering across a structured Obsidian vault.</w:t>
       </w:r>
     </w:p>
     <w:p>
       <w:pPr>
-        <w:pStyle w:val="ListBullet"/>
-        <w:spacing w:after="30" w:line="245" w:lineRule="auto"/>
-        <w:ind w:left="288" w:hanging="230"/>
+        <w:pStyle w:val="ResumeBullet"/>
+        <w:spacing w:before="0" w:after="14" w:line="240" w:lineRule="auto"/>
       </w:pPr>
       <w:r>
+        <w:rPr>
+          <w:rFonts w:ascii="Arial" w:hAnsi="Arial"/>
+          <w:b w:val="0"/>
+          <w:i w:val="0"/>
+          <w:color w:val="000000"/>
+          <w:sz w:val="19"/>
+        </w:rPr>
         <w:t>Preserves note metadata and source context so retrieval remains inspectable as models and embedding backends change.</w:t>
       </w:r>
     </w:p>
     <w:p>
       <w:pPr>
-        <w:keepNext/>
-        <w:spacing w:before="60" w:after="20"/>
+        <w:pStyle w:val="ResumeEntry"/>
+        <w:tabs>
+          <w:tab w:pos="10656" w:val="right"/>
+        </w:tabs>
+        <w:spacing w:before="24" w:after="8" w:line="240" w:lineRule="auto"/>
       </w:pPr>
       <w:r>
         <w:rPr>
+          <w:rFonts w:ascii="Arial" w:hAnsi="Arial"/>
           <w:b/>
-          <w:sz w:val="19"/>
+          <w:i w:val="0"/>
+          <w:color w:val="000000"/>
+          <w:sz w:val="20"/>
         </w:rPr>
         <w:t>Ayumad.me</w:t>
       </w:r>
       <w:r>
         <w:rPr>
+          <w:rFonts w:ascii="Arial" w:hAnsi="Arial"/>
+          <w:b w:val="0"/>
           <w:i/>
+          <w:color w:val="000000"/>
+          <w:sz w:val="19"/>
+        </w:rPr>
+        <w:t xml:space="preserve">  |  Portfolio and public knowledge layer</w:t>
+      </w:r>
+      <w:r>
+        <w:rPr>
+          <w:rFonts w:ascii="Arial" w:hAnsi="Arial"/>
+          <w:b w:val="0"/>
+          <w:i/>
+          <w:color w:val="464646"/>
           <w:sz w:val="18"/>
         </w:rPr>
-        <w:t xml:space="preserve">  |  React, TypeScript, Vite, Vercel</w:t>
+        <w:tab/>
+        <w:t>React · TypeScript · Vite · Vercel</w:t>
       </w:r>
     </w:p>
     <w:p>
       <w:pPr>
-        <w:pStyle w:val="ListBullet"/>
-        <w:spacing w:after="30" w:line="245" w:lineRule="auto"/>
-        <w:ind w:left="288" w:hanging="230"/>
+        <w:pStyle w:val="ResumeBullet"/>
+        <w:spacing w:before="0" w:after="14" w:line="240" w:lineRule="auto"/>
       </w:pPr>
       <w:r>
-        <w:t>Built a responsive portfolio and public knowledge layer with dynamic project, system, gear, and Markdown article routes.</w:t>
+        <w:rPr>
+          <w:rFonts w:ascii="Arial" w:hAnsi="Arial"/>
+          <w:b w:val="0"/>
+          <w:i w:val="0"/>
+          <w:color w:val="000000"/>
+          <w:sz w:val="19"/>
+        </w:rPr>
+        <w:t>Built a responsive portfolio with dynamic project, system, gear, and Markdown article routes backed by a structured content layer.</w:t>
       </w:r>
     </w:p>
     <w:p>
       <w:pPr>
-        <w:pStyle w:val="ListBullet"/>
-        <w:spacing w:after="30" w:line="245" w:lineRule="auto"/>
-        <w:ind w:left="288" w:hanging="230"/>
+        <w:pStyle w:val="ResumeBullet"/>
+        <w:spacing w:before="0" w:after="14" w:line="240" w:lineRule="auto"/>
       </w:pPr>
       <w:r>
-        <w:t>Created five content-aware visual modes with accessible controls, mode-specific motion, and optimized canvas particle rendering.</w:t>
+        <w:rPr>
+          <w:rFonts w:ascii="Arial" w:hAnsi="Arial"/>
+          <w:b w:val="0"/>
+          <w:i w:val="0"/>
+          <w:color w:val="000000"/>
+          <w:sz w:val="19"/>
+        </w:rPr>
+        <w:t>Created five content-aware visual modes with accessible controls, mode-specific transitions, and optimized canvas particle rendering.</w:t>
       </w:r>
     </w:p>
     <w:p>
       <w:pPr>
-        <w:keepNext/>
-        <w:spacing w:before="60" w:after="20"/>
+        <w:pStyle w:val="ResumeEntry"/>
+        <w:tabs>
+          <w:tab w:pos="10656" w:val="right"/>
+        </w:tabs>
+        <w:spacing w:before="24" w:after="8" w:line="240" w:lineRule="auto"/>
       </w:pPr>
       <w:r>
         <w:rPr>
+          <w:rFonts w:ascii="Arial" w:hAnsi="Arial"/>
           <w:b/>
-          <w:sz w:val="19"/>
+          <w:i w:val="0"/>
+          <w:color w:val="000000"/>
+          <w:sz w:val="20"/>
         </w:rPr>
         <w:t>Homelab</w:t>
       </w:r>
       <w:r>
         <w:rPr>
+          <w:rFonts w:ascii="Arial" w:hAnsi="Arial"/>
+          <w:b w:val="0"/>
           <w:i/>
+          <w:color w:val="000000"/>
+          <w:sz w:val="19"/>
+        </w:rPr>
+        <w:t xml:space="preserve">  |  Infrastructure</w:t>
+      </w:r>
+      <w:r>
+        <w:rPr>
+          <w:rFonts w:ascii="Arial" w:hAnsi="Arial"/>
+          <w:b w:val="0"/>
+          <w:i/>
+          <w:color w:val="464646"/>
           <w:sz w:val="18"/>
         </w:rPr>
-        <w:t xml:space="preserve">  |  Proxmox, ZFS, virtualization</w:t>
+        <w:tab/>
+        <w:t>Proxmox VE · ZFS · Linux · Virtualization</w:t>
       </w:r>
     </w:p>
     <w:p>
       <w:pPr>
-        <w:pStyle w:val="ListBullet"/>
-        <w:spacing w:after="30" w:line="245" w:lineRule="auto"/>
-        <w:ind w:left="288" w:hanging="230"/>
+        <w:pStyle w:val="ResumeBullet"/>
+        <w:spacing w:before="0" w:after="14" w:line="240" w:lineRule="auto"/>
       </w:pPr>
       <w:r>
+        <w:rPr>
+          <w:rFonts w:ascii="Arial" w:hAnsi="Arial"/>
+          <w:b w:val="0"/>
+          <w:i w:val="0"/>
+          <w:color w:val="000000"/>
+          <w:sz w:val="19"/>
+        </w:rPr>
         <w:t>Repurposed a ThinkStation P520 as a virtualization and storage host for durable services and isolated experiments.</w:t>
       </w:r>
     </w:p>
     <w:p>
       <w:pPr>
-        <w:pStyle w:val="ListBullet"/>
-        <w:spacing w:after="30" w:line="245" w:lineRule="auto"/>
-        <w:ind w:left="288" w:hanging="230"/>
+        <w:pStyle w:val="ResumeBullet"/>
+        <w:spacing w:before="0" w:after="14" w:line="240" w:lineRule="auto"/>
       </w:pPr>
       <w:r>
-        <w:t>Organizes workloads around clear recovery boundaries so testing can change without destabilizing core services.</w:t>
+        <w:rPr>
+          <w:rFonts w:ascii="Arial" w:hAnsi="Arial"/>
+          <w:b w:val="0"/>
+          <w:i w:val="0"/>
+          <w:color w:val="000000"/>
+          <w:sz w:val="19"/>
+        </w:rPr>
+        <w:t>Organizes workloads around explicit recovery boundaries so experiments can change without destabilizing core services.</w:t>
       </w:r>
     </w:p>
     <w:p>
       <w:pPr>
-        <w:keepNext/>
-        <w:spacing w:before="140" w:after="60"/>
+        <w:pStyle w:val="ResumeSection"/>
+        <w:spacing w:before="110" w:after="50" w:line="240" w:lineRule="auto"/>
         <w:pBdr>
-          <w:bottom w:val="single" w:sz="6" w:space="2" w:color="B7B7B7"/>
+          <w:bottom w:val="single" w:sz="6" w:space="1" w:color="000000"/>
         </w:pBdr>
       </w:pPr>
       <w:r>
         <w:rPr>
           <w:rFonts w:ascii="Arial" w:hAnsi="Arial"/>
           <w:b/>
+          <w:i w:val="0"/>
+          <w:color w:val="000000"/>
+          <w:sz w:val="21"/>
+        </w:rPr>
+        <w:t>LEADERSHIP &amp; EXPERIENCE</w:t>
+      </w:r>
+    </w:p>
+    <w:p>
+      <w:pPr>
+        <w:pStyle w:val="ResumeEntry"/>
+        <w:tabs>
+          <w:tab w:pos="10656" w:val="right"/>
+        </w:tabs>
+        <w:spacing w:before="24" w:after="8" w:line="240" w:lineRule="auto"/>
+      </w:pPr>
+      <w:r>
+        <w:rPr>
+          <w:rFonts w:ascii="Arial" w:hAnsi="Arial"/>
+          <w:b/>
+          <w:i w:val="0"/>
+          <w:color w:val="000000"/>
+          <w:sz w:val="20"/>
+        </w:rPr>
+        <w:t>Data Science &amp; AI Club</w:t>
+      </w:r>
+      <w:r>
+        <w:rPr>
+          <w:rFonts w:ascii="Arial" w:hAnsi="Arial"/>
+          <w:b w:val="0"/>
+          <w:i/>
+          <w:color w:val="000000"/>
+          <w:sz w:val="19"/>
+        </w:rPr>
+        <w:t xml:space="preserve">  |  Co-President</w:t>
+      </w:r>
+      <w:r>
+        <w:rPr>
+          <w:rFonts w:ascii="Arial" w:hAnsi="Arial"/>
+          <w:b w:val="0"/>
+          <w:i/>
+          <w:color w:val="464646"/>
+          <w:sz w:val="18"/>
+        </w:rPr>
+        <w:tab/>
+        <w:t>Foothill College</w:t>
+      </w:r>
+    </w:p>
+    <w:p>
+      <w:pPr>
+        <w:pStyle w:val="ResumeBullet"/>
+        <w:spacing w:before="0" w:after="14" w:line="240" w:lineRule="auto"/>
+      </w:pPr>
+      <w:r>
+        <w:rPr>
+          <w:rFonts w:ascii="Arial" w:hAnsi="Arial"/>
+          <w:b w:val="0"/>
+          <w:i w:val="0"/>
+          <w:color w:val="000000"/>
+          <w:sz w:val="19"/>
+        </w:rPr>
+        <w:t>Integrated the Google Data Analytics curriculum into club programming and taught practical data manipulation and visualization workflows.</w:t>
+      </w:r>
+    </w:p>
+    <w:p>
+      <w:pPr>
+        <w:pStyle w:val="ResumeBullet"/>
+        <w:spacing w:before="0" w:after="14" w:line="240" w:lineRule="auto"/>
+      </w:pPr>
+      <w:r>
+        <w:rPr>
+          <w:rFonts w:ascii="Arial" w:hAnsi="Arial"/>
+          <w:b w:val="0"/>
+          <w:i w:val="0"/>
+          <w:color w:val="000000"/>
+          <w:sz w:val="19"/>
+        </w:rPr>
+        <w:t>Developed Owlbot, a GPT-3.5-based campus chatbot, and mentored members through a Random Forest project for the Kaggle Titanic competition.</w:t>
+      </w:r>
+    </w:p>
+    <w:p>
+      <w:pPr>
+        <w:pStyle w:val="ResumeEntry"/>
+        <w:tabs>
+          <w:tab w:pos="10656" w:val="right"/>
+        </w:tabs>
+        <w:spacing w:before="24" w:after="8" w:line="240" w:lineRule="auto"/>
+      </w:pPr>
+      <w:r>
+        <w:rPr>
+          <w:rFonts w:ascii="Arial" w:hAnsi="Arial"/>
+          <w:b/>
+          <w:i w:val="0"/>
+          <w:color w:val="000000"/>
+          <w:sz w:val="20"/>
+        </w:rPr>
+        <w:t>OwlHacks</w:t>
+      </w:r>
+      <w:r>
+        <w:rPr>
+          <w:rFonts w:ascii="Arial" w:hAnsi="Arial"/>
+          <w:b w:val="0"/>
+          <w:i/>
+          <w:color w:val="000000"/>
+          <w:sz w:val="19"/>
+        </w:rPr>
+        <w:t xml:space="preserve">  |  Vice President of Logistics</w:t>
+      </w:r>
+      <w:r>
+        <w:rPr>
+          <w:rFonts w:ascii="Arial" w:hAnsi="Arial"/>
+          <w:b w:val="0"/>
+          <w:i/>
+          <w:color w:val="464646"/>
+          <w:sz w:val="18"/>
+        </w:rPr>
+        <w:tab/>
+        <w:t>Foothill College</w:t>
+      </w:r>
+    </w:p>
+    <w:p>
+      <w:pPr>
+        <w:pStyle w:val="ResumeBullet"/>
+        <w:spacing w:before="0" w:after="14" w:line="240" w:lineRule="auto"/>
+      </w:pPr>
+      <w:r>
+        <w:rPr>
+          <w:rFonts w:ascii="Arial" w:hAnsi="Arial"/>
+          <w:b w:val="0"/>
+          <w:i w:val="0"/>
+          <w:color w:val="000000"/>
+          <w:sz w:val="19"/>
+        </w:rPr>
+        <w:t>Coordinated schedules, technical supplies, catering, and workshop logistics for a three-day technology event serving 150+ attendees.</w:t>
+      </w:r>
+    </w:p>
+    <w:p>
+      <w:pPr>
+        <w:pStyle w:val="ResumeBullet"/>
+        <w:spacing w:before="0" w:after="14" w:line="240" w:lineRule="auto"/>
+      </w:pPr>
+      <w:r>
+        <w:rPr>
+          <w:rFonts w:ascii="Arial" w:hAnsi="Arial"/>
+          <w:b w:val="0"/>
+          <w:i w:val="0"/>
+          <w:color w:val="000000"/>
+          <w:sz w:val="19"/>
+        </w:rPr>
+        <w:t>Led 30+ volunteers and committee vice presidents through event execution, including workshops covering game development, CAD, and React.</w:t>
+      </w:r>
+    </w:p>
+    <w:p>
+      <w:pPr>
+        <w:pStyle w:val="ResumeSection"/>
+        <w:spacing w:before="110" w:after="50" w:line="240" w:lineRule="auto"/>
+        <w:pBdr>
+          <w:bottom w:val="single" w:sz="6" w:space="1" w:color="000000"/>
+        </w:pBdr>
+      </w:pPr>
+      <w:r>
+        <w:rPr>
+          <w:rFonts w:ascii="Arial" w:hAnsi="Arial"/>
+          <w:b/>
+          <w:i w:val="0"/>
+          <w:color w:val="000000"/>
           <w:sz w:val="21"/>
         </w:rPr>
         <w:t>TECHNICAL SKILLS</w:t>
@@ -309,67 +674,112 @@
     </w:p>
     <w:p>
       <w:pPr>
-        <w:spacing w:after="0"/>
+        <w:spacing w:before="0" w:after="10" w:line="240" w:lineRule="auto"/>
       </w:pPr>
       <w:r>
         <w:rPr>
+          <w:rFonts w:ascii="Arial" w:hAnsi="Arial"/>
           <w:b/>
+          <w:i w:val="0"/>
+          <w:color w:val="000000"/>
+          <w:sz w:val="19"/>
         </w:rPr>
         <w:t xml:space="preserve">Languages: </w:t>
       </w:r>
       <w:r>
-        <w:t>Python, C++, TypeScript, JavaScript, HTML/CSS</w:t>
-        <w:br/>
+        <w:rPr>
+          <w:rFonts w:ascii="Arial" w:hAnsi="Arial"/>
+          <w:b w:val="0"/>
+          <w:i w:val="0"/>
+          <w:color w:val="000000"/>
+          <w:sz w:val="19"/>
+        </w:rPr>
+        <w:t>Python, C++, TypeScript, JavaScript, SQL, HTML/CSS</w:t>
+      </w:r>
+    </w:p>
+    <w:p>
+      <w:pPr>
+        <w:spacing w:before="0" w:after="10" w:line="240" w:lineRule="auto"/>
+      </w:pPr>
+      <w:r>
+        <w:rPr>
+          <w:rFonts w:ascii="Arial" w:hAnsi="Arial"/>
+          <w:b/>
+          <w:i w:val="0"/>
+          <w:color w:val="000000"/>
+          <w:sz w:val="19"/>
+        </w:rPr>
+        <w:t xml:space="preserve">AI &amp; Data: </w:t>
       </w:r>
       <w:r>
         <w:rPr>
+          <w:rFonts w:ascii="Arial" w:hAnsi="Arial"/>
+          <w:b w:val="0"/>
+          <w:i w:val="0"/>
+          <w:color w:val="000000"/>
+          <w:sz w:val="19"/>
+        </w:rPr>
+        <w:t>PyTorch, TensorFlow, Pandas, retrieval-augmented generation, embeddings, agent workflows</w:t>
+      </w:r>
+    </w:p>
+    <w:p>
+      <w:pPr>
+        <w:spacing w:before="0" w:after="10" w:line="240" w:lineRule="auto"/>
+      </w:pPr>
+      <w:r>
+        <w:rPr>
+          <w:rFonts w:ascii="Arial" w:hAnsi="Arial"/>
           <w:b/>
+          <w:i w:val="0"/>
+          <w:color w:val="000000"/>
+          <w:sz w:val="19"/>
         </w:rPr>
         <w:t xml:space="preserve">Systems: </w:t>
       </w:r>
       <w:r>
+        <w:rPr>
+          <w:rFonts w:ascii="Arial" w:hAnsi="Arial"/>
+          <w:b w:val="0"/>
+          <w:i w:val="0"/>
+          <w:color w:val="000000"/>
+          <w:sz w:val="19"/>
+        </w:rPr>
         <w:t>Linux, Proxmox VE, ZFS, Docker, virtualization, Tailscale</w:t>
-        <w:br/>
+      </w:r>
+    </w:p>
+    <w:p>
+      <w:pPr>
+        <w:spacing w:before="0" w:after="10" w:line="240" w:lineRule="auto"/>
+      </w:pPr>
+      <w:r>
+        <w:rPr>
+          <w:rFonts w:ascii="Arial" w:hAnsi="Arial"/>
+          <w:b/>
+          <w:i w:val="0"/>
+          <w:color w:val="000000"/>
+          <w:sz w:val="19"/>
+        </w:rPr>
+        <w:t xml:space="preserve">Web &amp; Tools: </w:t>
       </w:r>
       <w:r>
         <w:rPr>
-          <w:b/>
+          <w:rFonts w:ascii="Arial" w:hAnsi="Arial"/>
+          <w:b w:val="0"/>
+          <w:i w:val="0"/>
+          <w:color w:val="000000"/>
+          <w:sz w:val="19"/>
         </w:rPr>
-        <w:t xml:space="preserve">Web + AI: </w:t>
-      </w:r>
-      <w:r>
-        <w:t>React, Vite, Vercel, retrieval-augmented generation, embeddings, agent workflows</w:t>
+        <w:t>React, Vite, Vercel, Git, Fusion 360, SolidWorks</w:t>
       </w:r>
     </w:p>
     <w:sectPr>
-      <w:footerReference w:type="default" r:id="rId12"/>
       <w:pgSz w:w="12240" w:h="15840"/>
-      <w:pgMar w:top="936" w:right="1123" w:bottom="936" w:left="1123" w:header="432" w:footer="432" w:gutter="0"/>
+      <w:pgMar w:top="691" w:right="792" w:bottom="662" w:left="792" w:header="288" w:footer="288" w:gutter="0"/>
       <w:cols w:space="720"/>
       <w:docGrid w:linePitch="360"/>
     </w:sectPr>
   </w:body>
 </w:document>
-</file>
-
-<file path=word/footer1.xml><?xml version="1.0" encoding="utf-8"?>
-<w:ftr xmlns:m="http://schemas.openxmlformats.org/officeDocument/2006/math" xmlns:mc="http://schemas.openxmlformats.org/markup-compatibility/2006" xmlns:mo="http://schemas.microsoft.com/office/mac/office/2008/main" xmlns:mv="urn:schemas-microsoft-com:mac:vml" xmlns:o="urn:schemas-microsoft-com:office:office" xmlns:r="http://schemas.openxmlformats.org/officeDocument/2006/relationships" xmlns:v="urn:schemas-microsoft-com:vml" xmlns:w10="urn:schemas-microsoft-com:office:word" xmlns:w14="http://schemas.microsoft.com/office/word/2010/wordml" xmlns:w="http://schemas.openxmlformats.org/wordprocessingml/2006/main" xmlns:wne="http://schemas.microsoft.com/office/word/2006/wordml" xmlns:wp14="http://schemas.microsoft.com/office/word/2010/wordprocessingDrawing" xmlns:wp="http://schemas.openxmlformats.org/drawingml/2006/wordprocessingDrawing" xmlns:wpc="http://schemas.microsoft.com/office/word/2010/wordprocessingCanvas" xmlns:wpg="http://schemas.microsoft.com/office/word/2010/wordprocessingGroup" xmlns:wpi="http://schemas.microsoft.com/office/word/2010/wordprocessingInk" xmlns:wps="http://schemas.microsoft.com/office/word/2010/wordprocessingShape" mc:Ignorable="w14 wp14">
-  <w:p>
-    <w:pPr>
-      <w:pStyle w:val="Footer"/>
-      <w:spacing w:before="0"/>
-      <w:jc w:val="center"/>
-    </w:pPr>
-    <w:r>
-      <w:rPr>
-        <w:rFonts w:ascii="Arial" w:hAnsi="Arial"/>
-        <w:color w:val="646464"/>
-        <w:sz w:val="15"/>
-      </w:rPr>
-      <w:t>AYUMAD.ME  •  AI + SYSTEMS</w:t>
-    </w:r>
-  </w:p>
-</w:ftr>
 </file>
 
 <file path=word/numbering.xml><?xml version="1.0" encoding="utf-8"?>
@@ -736,11 +1146,12 @@
     <w:qFormat/>
     <w:rsid w:val="00FC693F"/>
     <w:pPr>
-      <w:spacing w:after="60" w:line="250" w:lineRule="auto"/>
+      <w:spacing w:before="0" w:after="0" w:line="240" w:lineRule="auto"/>
     </w:pPr>
     <w:rPr>
       <w:rFonts w:ascii="Arial" w:hAnsi="Arial"/>
-      <w:sz w:val="19"/>
+      <w:color w:val="000000"/>
+      <w:sz w:val="20"/>
     </w:rPr>
   </w:style>
   <w:style w:type="paragraph" w:styleId="Header">
@@ -798,15 +1209,15 @@
     <w:pPr>
       <w:keepNext/>
       <w:keepLines/>
-      <w:spacing w:before="140" w:after="60"/>
+      <w:spacing w:before="480" w:after="0"/>
       <w:outlineLvl w:val="0"/>
     </w:pPr>
     <w:rPr>
-      <w:rFonts w:asciiTheme="majorHAnsi" w:eastAsiaTheme="majorEastAsia" w:hAnsiTheme="majorHAnsi" w:cstheme="majorBidi" w:ascii="Arial" w:hAnsi="Arial"/>
+      <w:rFonts w:asciiTheme="majorHAnsi" w:eastAsiaTheme="majorEastAsia" w:hAnsiTheme="majorHAnsi" w:cstheme="majorBidi"/>
       <w:b/>
       <w:bCs/>
-      <w:color w:val="000000"/>
-      <w:sz w:val="25"/>
+      <w:color w:val="365F91" w:themeColor="accent1" w:themeShade="BF"/>
+      <w:sz w:val="28"/>
       <w:szCs w:val="28"/>
     </w:rPr>
   </w:style>
@@ -822,15 +1233,15 @@
     <w:pPr>
       <w:keepNext/>
       <w:keepLines/>
-      <w:spacing w:before="140" w:after="60"/>
+      <w:spacing w:before="200" w:after="0"/>
       <w:outlineLvl w:val="1"/>
     </w:pPr>
     <w:rPr>
-      <w:rFonts w:asciiTheme="majorHAnsi" w:eastAsiaTheme="majorEastAsia" w:hAnsiTheme="majorHAnsi" w:cstheme="majorBidi" w:ascii="Arial" w:hAnsi="Arial"/>
+      <w:rFonts w:asciiTheme="majorHAnsi" w:eastAsiaTheme="majorEastAsia" w:hAnsiTheme="majorHAnsi" w:cstheme="majorBidi"/>
       <w:b/>
       <w:bCs/>
-      <w:color w:val="000000"/>
-      <w:sz w:val="21"/>
+      <w:color w:val="4F81BD" w:themeColor="accent1"/>
+      <w:sz w:val="26"/>
       <w:szCs w:val="26"/>
     </w:rPr>
   </w:style>
@@ -846,15 +1257,14 @@
     <w:pPr>
       <w:keepNext/>
       <w:keepLines/>
-      <w:spacing w:before="140" w:after="60"/>
+      <w:spacing w:before="200" w:after="0"/>
       <w:outlineLvl w:val="2"/>
     </w:pPr>
     <w:rPr>
-      <w:rFonts w:asciiTheme="majorHAnsi" w:eastAsiaTheme="majorEastAsia" w:hAnsiTheme="majorHAnsi" w:cstheme="majorBidi" w:ascii="Arial" w:hAnsi="Arial"/>
+      <w:rFonts w:asciiTheme="majorHAnsi" w:eastAsiaTheme="majorEastAsia" w:hAnsiTheme="majorHAnsi" w:cstheme="majorBidi"/>
       <w:b/>
       <w:bCs/>
-      <w:color w:val="000000"/>
-      <w:sz w:val="20"/>
+      <w:color w:val="4F81BD" w:themeColor="accent1"/>
     </w:rPr>
   </w:style>
   <w:style w:type="paragraph" w:styleId="Heading4">
@@ -12422,6 +12832,23 @@
         <w:shd w:val="clear" w:color="auto" w:fill="FBCAA2" w:themeFill="accent6" w:themeFillTint="7F"/>
       </w:tcPr>
     </w:tblStylePr>
+  </w:style>
+  <w:style w:type="paragraph" w:customStyle="1" w:styleId="ResumeSection">
+    <w:name w:val="Resume Section"/>
+  </w:style>
+  <w:style w:type="paragraph" w:customStyle="1" w:styleId="ResumeEntry">
+    <w:name w:val="Resume Entry"/>
+  </w:style>
+  <w:style w:type="paragraph" w:customStyle="1" w:styleId="ResumeBullet">
+    <w:name w:val="Resume Bullet"/>
+    <w:basedOn w:val="ListBullet"/>
+    <w:pPr>
+      <w:ind w:left="274" w:hanging="202" w:right="29"/>
+    </w:pPr>
+    <w:rPr>
+      <w:rFonts w:ascii="Arial" w:hAnsi="Arial"/>
+      <w:sz w:val="19"/>
+    </w:rPr>
   </w:style>
 </w:styles>
 </file>

</xml_diff>